<commit_message>
Segunda revisión de la documentación
Anonimiza las fichas A55, F52 y J54. Alinea el backlog, la estrategia de
pruebas, el modelo de datos, el cierre del ADR-023 y la planificación del
sprint 1 con el calendario v1.3 y con la numeración de requisitos de la
arquitectura v1.1. Corrige datos puntuales de la arquitectura y deja
anotado lo pendiente para la v1.2. Ajusta la redacción de la guía 2.4 y
del diario 2.1, y reemplaza los archivos vacíos de las carpetas sin
evidencias por .gitkeep.

Co-Authored-By: Claude Opus 5.5 <noreply@anthropic.com>
Claude-Session: https://claude.ai/code/session_01UQmWnQCHoBhPGiwYQje9ct
</commit_message>
<xml_diff>
--- a/Fase 2/Evidencias Grupales/2.4_GuiaEstudiante_Fase 2_Desarrollo Proyecto APT(Español).docx
+++ b/Fase 2/Evidencias Grupales/2.4_GuiaEstudiante_Fase 2_Desarrollo Proyecto APT(Español).docx
@@ -3931,7 +3931,7 @@
                 <w:color w:val="1A1A1A"/>
                 <w:sz w:val="16"/>
               </w:rPr>
-              <w:t>Nuevo plazo: antes del sprint 4 (6 de noviembre). Orienta la fase 2 y no condiciona el semestre.</w:t>
+              <w:t>Nuevo plazo: antes del sprint 4 (6 de noviembre). Orienta la hoja de ruta del producto más allá del semestre, sin condicionar el MVP.</w:t>
             </w:r>
           </w:p>
         </w:tc>
@@ -7198,7 +7198,7 @@
                 <w:color w:val="1A1A1A"/>
                 <w:sz w:val="20"/>
               </w:rPr>
-              <w:t xml:space="preserve"> Motivo: la extensión del sprint 0 ocupó la semana 9. Estrategia: cuatro entrevistas antes del sprint 4 (6 de noviembre), reclutadas por canal concentrado. Como el reparto del gasto ya salió del alcance comprometido, su resultado orienta la fase 2 y no condiciona el semestre.</w:t>
+              <w:t xml:space="preserve"> Motivo: la extensión del sprint 0 ocupó la semana 9. Estrategia: cuatro entrevistas antes del sprint 4 (6 de noviembre), reclutadas por canal concentrado. Como el reparto del gasto ya salió del alcance comprometido, su resultado orienta la hoja de ruta del producto más allá del semestre, sin condicionar el MVP.</w:t>
             </w:r>
           </w:p>
           <w:p>

</xml_diff>